<commit_message>
feat: checkpoint workflow and robot description integration
</commit_message>
<xml_diff>
--- a/Workspace/docs/DENTOBOT_Daily_Compass.docx
+++ b/Workspace/docs/DENTOBOT_Daily_Compass.docx
@@ -180,14 +180,8 @@
             <w:vAlign w:val="top"/>
           </w:tcPr>
           <w:p>
-            <w:pPr>
-              <w:pStyle w:val="TableText"/>
-            </w:pPr>
-            <w:r>
-              <w:rPr>
-                <w:rFonts w:ascii="Calibri" w:hAnsi="Calibri" w:eastAsia="Calibri"/>
-              </w:rPr>
-              <w:t>13 August 2026</w:t>
+            <w:r>
+              <w:t>14 August 2026</w:t>
             </w:r>
           </w:p>
         </w:tc>
@@ -220,14 +214,8 @@
             <w:vAlign w:val="top"/>
           </w:tcPr>
           <w:p>
-            <w:pPr>
-              <w:pStyle w:val="TableText"/>
-            </w:pPr>
-            <w:r>
-              <w:rPr>
-                <w:rFonts w:ascii="Calibri" w:hAnsi="Calibri" w:eastAsia="Calibri"/>
-              </w:rPr>
-              <w:t>Freeze and prove a bounded Template V0 PoC</w:t>
+            <w:r>
+              <w:t>Freeze and prove bounded Template V0; inspect and calibrate the simulation-only robot description without motion</w:t>
             </w:r>
           </w:p>
         </w:tc>

</xml_diff>

<commit_message>
feat: checkpoint workflow simulation and case persistence
</commit_message>
<xml_diff>
--- a/Workspace/docs/DENTOBOT_Daily_Compass.docx
+++ b/Workspace/docs/DENTOBOT_Daily_Compass.docx
@@ -181,7 +181,7 @@
           </w:tcPr>
           <w:p>
             <w:r>
-              <w:t>14 August 2026</w:t>
+              <w:t>24 August 2026</w:t>
             </w:r>
           </w:p>
         </w:tc>
@@ -215,7 +215,7 @@
           </w:tcPr>
           <w:p>
             <w:r>
-              <w:t>Freeze and prove bounded Template V0; inspect and calibrate the simulation-only robot description without motion</w:t>
+              <w:t>Validate transactional DENTOBOT case packages in graphical Slicer; regenerate current Step 4C/5C outputs before Step 6; continue bounded Template V0 evidence without robot motion</w:t>
             </w:r>
           </w:p>
         </w:tc>

</xml_diff>

<commit_message>
docs: reconcile step6 strategy and project tracker
</commit_message>
<xml_diff>
--- a/Workspace/docs/DENTOBOT_Daily_Compass.docx
+++ b/Workspace/docs/DENTOBOT_Daily_Compass.docx
@@ -177,11 +177,15 @@
         <w:tc>
           <w:tcPr>
             <w:tcW w:w="7060" w:type="dxa"/>
-            <w:vAlign w:val="top"/>
-          </w:tcPr>
-          <w:p>
-            <w:r>
-              <w:t>24 August 2026</w:t>
+            <w:vAlign w:val="center"/>
+          </w:tcPr>
+          <w:p>
+            <w:pPr>
+              <w:pStyle w:val="FillText"/>
+            </w:pPr>
+            <w:r/>
+            <w:r>
+              <w:t>28 August 2026</w:t>
             </w:r>
           </w:p>
         </w:tc>
@@ -211,11 +215,15 @@
         <w:tc>
           <w:tcPr>
             <w:tcW w:w="7060" w:type="dxa"/>
-            <w:vAlign w:val="top"/>
-          </w:tcPr>
-          <w:p>
-            <w:r>
-              <w:t>Validate transactional DENTOBOT case packages in graphical Slicer; regenerate current Step 4C/5C outputs before Step 6; continue bounded Template V0 evidence without robot motion</w:t>
+            <w:vAlign w:val="center"/>
+          </w:tcPr>
+          <w:p>
+            <w:pPr>
+              <w:pStyle w:val="FillText"/>
+            </w:pPr>
+            <w:r/>
+            <w:r>
+              <w:t>Priority-0 Step 6 simulation stabilization: audit collision geometry, diagnose the exact partial-path failure, and expose a guarded three-stage preview. Verification is operator-led and simulation-only.</w:t>
             </w:r>
           </w:p>
         </w:tc>
@@ -405,18 +413,16 @@
         <w:tc>
           <w:tcPr>
             <w:tcW w:w="7060" w:type="dxa"/>
-            <w:vAlign w:val="top"/>
-            <w:shd w:val="clear" w:color="auto" w:fill="FFFBE8"/>
-          </w:tcPr>
-          <w:p>
-            <w:pPr>
-              <w:pStyle w:val="FillText"/>
-            </w:pPr>
-            <w:r>
-              <w:rPr>
-                <w:rFonts w:ascii="Calibri" w:hAnsi="Calibri" w:eastAsia="Calibri"/>
-              </w:rPr>
-              <w:t>[Type here]</w:t>
+            <w:vAlign w:val="center"/>
+            <w:shd w:val="clear" w:color="auto" w:fill="FFFBE8"/>
+          </w:tcPr>
+          <w:p>
+            <w:pPr>
+              <w:pStyle w:val="FillText"/>
+            </w:pPr>
+            <w:r/>
+            <w:r>
+              <w:t>28 August 2026 · IITM Ubuntu development workstation</w:t>
             </w:r>
           </w:p>
         </w:tc>
@@ -446,18 +452,16 @@
         <w:tc>
           <w:tcPr>
             <w:tcW w:w="7060" w:type="dxa"/>
-            <w:vAlign w:val="top"/>
-            <w:shd w:val="clear" w:color="auto" w:fill="FFFBE8"/>
-          </w:tcPr>
-          <w:p>
-            <w:pPr>
-              <w:pStyle w:val="FillText"/>
-            </w:pPr>
-            <w:r>
-              <w:rPr>
-                <w:rFonts w:ascii="Calibri" w:hAnsi="Calibri" w:eastAsia="Calibri"/>
-              </w:rPr>
-              <w:t>[What must be true by the end of today?]</w:t>
+            <w:vAlign w:val="center"/>
+            <w:shd w:val="clear" w:color="auto" w:fill="FFFBE8"/>
+          </w:tcPr>
+          <w:p>
+            <w:pPr>
+              <w:pStyle w:val="FillText"/>
+            </w:pPr>
+            <w:r/>
+            <w:r>
+              <w:t>Stop treating a MoveIt percentage as the answer; make geometry, frames, and the first failing robot state visible before optimization.</w:t>
             </w:r>
           </w:p>
         </w:tc>
@@ -487,18 +491,16 @@
         <w:tc>
           <w:tcPr>
             <w:tcW w:w="7060" w:type="dxa"/>
-            <w:vAlign w:val="top"/>
-            <w:shd w:val="clear" w:color="auto" w:fill="FFFBE8"/>
-          </w:tcPr>
-          <w:p>
-            <w:pPr>
-              <w:pStyle w:val="FillText"/>
-            </w:pPr>
-            <w:r>
-              <w:rPr>
-                <w:rFonts w:ascii="Calibri" w:hAnsi="Calibri" w:eastAsia="Calibri"/>
-              </w:rPr>
-              <w:t>[Type here]</w:t>
+            <w:vAlign w:val="center"/>
+            <w:shd w:val="clear" w:color="auto" w:fill="FFFBE8"/>
+          </w:tcPr>
+          <w:p>
+            <w:pPr>
+              <w:pStyle w:val="FillText"/>
+            </w:pPr>
+            <w:r/>
+            <w:r>
+              <w:t>Reset the Priority-0 strategy to collision audit → structured diagnostics → explicit three-stage motion.</w:t>
             </w:r>
           </w:p>
         </w:tc>
@@ -528,18 +530,16 @@
         <w:tc>
           <w:tcPr>
             <w:tcW w:w="7060" w:type="dxa"/>
-            <w:vAlign w:val="top"/>
-            <w:shd w:val="clear" w:color="auto" w:fill="FFFBE8"/>
-          </w:tcPr>
-          <w:p>
-            <w:pPr>
-              <w:pStyle w:val="FillText"/>
-            </w:pPr>
-            <w:r>
-              <w:rPr>
-                <w:rFonts w:ascii="Calibri" w:hAnsi="Calibri" w:eastAsia="Calibri"/>
-              </w:rPr>
-              <w:t>[Type here]</w:t>
+            <w:vAlign w:val="center"/>
+            <w:shd w:val="clear" w:color="auto" w:fill="FFFBE8"/>
+          </w:tcPr>
+          <w:p>
+            <w:pPr>
+              <w:pStyle w:val="FillText"/>
+            </w:pPr>
+            <w:r/>
+            <w:r>
+              <w:t>Record that the current forehead plane/base snap is circular and cannot support a reachability or placement claim.</w:t>
             </w:r>
           </w:p>
         </w:tc>
@@ -569,18 +569,16 @@
         <w:tc>
           <w:tcPr>
             <w:tcW w:w="7060" w:type="dxa"/>
-            <w:vAlign w:val="top"/>
-            <w:shd w:val="clear" w:color="auto" w:fill="FFFBE8"/>
-          </w:tcPr>
-          <w:p>
-            <w:pPr>
-              <w:pStyle w:val="FillText"/>
-            </w:pPr>
-            <w:r>
-              <w:rPr>
-                <w:rFonts w:ascii="Calibri" w:hAnsi="Calibri" w:eastAsia="Calibri"/>
-              </w:rPr>
-              <w:t>[Type here]</w:t>
+            <w:vAlign w:val="center"/>
+            <w:shd w:val="clear" w:color="auto" w:fill="FFFBE8"/>
+          </w:tcPr>
+          <w:p>
+            <w:pPr>
+              <w:pStyle w:val="FillText"/>
+            </w:pPr>
+            <w:r/>
+            <w:r>
+              <w:t>Reconcile the Daily Compass and controlled task tracker so Now, Next, and Future are obvious again.</w:t>
             </w:r>
           </w:p>
         </w:tc>
@@ -610,18 +608,16 @@
         <w:tc>
           <w:tcPr>
             <w:tcW w:w="7060" w:type="dxa"/>
-            <w:vAlign w:val="top"/>
-            <w:shd w:val="clear" w:color="auto" w:fill="FFFBE8"/>
-          </w:tcPr>
-          <w:p>
-            <w:pPr>
-              <w:pStyle w:val="FillText"/>
-            </w:pPr>
-            <w:r>
-              <w:rPr>
-                <w:rFonts w:ascii="Calibri" w:hAnsi="Calibri" w:eastAsia="Calibri"/>
-              </w:rPr>
-              <w:t>[Feature creep / tempting side quest to reject today]</w:t>
+            <w:vAlign w:val="center"/>
+            <w:shd w:val="clear" w:color="auto" w:fill="FFFBE8"/>
+          </w:tcPr>
+          <w:p>
+            <w:pPr>
+              <w:pStyle w:val="FillText"/>
+            </w:pPr>
+            <w:r/>
+            <w:r>
+              <w:t>Planner tuning to force x4 to pass; automatic base optimization; broad diagnostic scripts; physical registration, hardware motion, or drilling.</w:t>
             </w:r>
           </w:p>
         </w:tc>
@@ -693,29 +689,33 @@
         <w:tc>
           <w:tcPr>
             <w:tcW w:w="9360" w:type="dxa"/>
-            <w:vAlign w:val="top"/>
-            <w:shd w:val="clear" w:color="auto" w:fill="FFFBE8"/>
-          </w:tcPr>
-          <w:p>
-            <w:pPr>
-              <w:pStyle w:val="FillText"/>
-            </w:pPr>
-            <w:r>
-              <w:rPr>
-                <w:rFonts w:ascii="Calibri" w:hAnsi="Calibri" w:eastAsia="Calibri"/>
-              </w:rPr>
-              <w:t>[Paste or type thoughts here. Add rows or paragraphs as needed.]</w:t>
-            </w:r>
-          </w:p>
-          <w:p>
-            <w:pPr>
-              <w:pStyle w:val="Body"/>
-            </w:pPr>
-          </w:p>
-          <w:p>
-            <w:pPr>
-              <w:pStyle w:val="Body"/>
-            </w:pPr>
+            <w:vAlign w:val="center"/>
+            <w:shd w:val="clear" w:color="auto" w:fill="FFFBE8"/>
+          </w:tcPr>
+          <w:p>
+            <w:pPr>
+              <w:pStyle w:val="FillText"/>
+            </w:pPr>
+            <w:r/>
+            <w:r>
+              <w:t>The project has moved beyond the earlier save/restore and Viewer firefighting. Those paths are substantially stabilized at software level, although normal-window and active-ROS lifecycle acceptance still have open items.</w:t>
+            </w:r>
+          </w:p>
+          <w:p>
+            <w:pPr>
+              <w:pStyle w:val="FillText"/>
+            </w:pPr>
+            <w:r>
+              <w:t>The key present insight is that x4's 44.44–45.34% Cartesian result is a symptom, not a causal diagnosis. The current API hides the adjacent last-valid/first-invalid states, and the current mount plane is not an independent forehead or mechanical-mount datum.</w:t>
+            </w:r>
+          </w:p>
+          <w:p>
+            <w:pPr>
+              <w:pStyle w:val="FillText"/>
+            </w:pPr>
+            <w:r>
+              <w:t>The next useful milestone is an operator-visible diagnostic loop that shows the exact collision payload, robot state, joint margins, IK/continuity result, and failure boundary without weakening safety rules.</w:t>
+            </w:r>
           </w:p>
         </w:tc>
       </w:tr>
@@ -1425,47 +1425,33 @@
         <w:tc>
           <w:tcPr>
             <w:tcW w:w="4680" w:type="dxa"/>
-            <w:vAlign w:val="top"/>
-            <w:shd w:val="clear" w:color="auto" w:fill="FFFBE8"/>
-          </w:tcPr>
-          <w:p>
-            <w:pPr>
-              <w:pStyle w:val="FillText"/>
-            </w:pPr>
-            <w:r>
-              <w:rPr>
-                <w:rFonts w:ascii="Calibri" w:hAnsi="Calibri" w:eastAsia="Calibri"/>
-              </w:rPr>
-              <w:t>[Reliable contracts/tests/workflows]</w:t>
-            </w:r>
-          </w:p>
-          <w:p>
-            <w:pPr>
-              <w:pStyle w:val="Body"/>
-            </w:pPr>
+            <w:vAlign w:val="center"/>
+            <w:shd w:val="clear" w:color="auto" w:fill="FFFBE8"/>
+          </w:tcPr>
+          <w:p>
+            <w:pPr>
+              <w:pStyle w:val="FillText"/>
+            </w:pPr>
+            <w:r/>
+            <w:r>
+              <w:t>Transactional .dentocase restore; freely selectable stages after restore; Step 6 Viewer crash fix; corrected inferior TMJ opening direction; simulation-only MoveIt guard; fail-closed rejection of partial drilling.</w:t>
+            </w:r>
           </w:p>
         </w:tc>
         <w:tc>
           <w:tcPr>
             <w:tcW w:w="4680" w:type="dxa"/>
-            <w:vAlign w:val="top"/>
-            <w:shd w:val="clear" w:color="auto" w:fill="FFFBE8"/>
-          </w:tcPr>
-          <w:p>
-            <w:pPr>
-              <w:pStyle w:val="FillText"/>
-            </w:pPr>
-            <w:r>
-              <w:rPr>
-                <w:rFonts w:ascii="Calibri" w:hAnsi="Calibri" w:eastAsia="Calibri"/>
-              </w:rPr>
-              <w:t>[Representative anatomy, clinician UX, physical fit, registration, mechanics]</w:t>
-            </w:r>
-          </w:p>
-          <w:p>
-            <w:pPr>
-              <w:pStyle w:val="Body"/>
-            </w:pPr>
+            <w:vAlign w:val="center"/>
+            <w:shd w:val="clear" w:color="auto" w:fill="FFFBE8"/>
+          </w:tcPr>
+          <w:p>
+            <w:pPr>
+              <w:pStyle w:val="FillText"/>
+            </w:pPr>
+            <w:r/>
+            <w:r>
+              <w:t>Representative condylar/crown landmark review; exact collision-payload audit; last-valid/first-invalid motion diagnosis; valid mount-frame semantics; tool fit, physical seating, registration, TCP and metrology.</w:t>
+            </w:r>
           </w:p>
         </w:tc>
       </w:tr>
@@ -1519,47 +1505,33 @@
         <w:tc>
           <w:tcPr>
             <w:tcW w:w="4680" w:type="dxa"/>
-            <w:vAlign w:val="top"/>
-            <w:shd w:val="clear" w:color="auto" w:fill="FFFBE8"/>
-          </w:tcPr>
-          <w:p>
-            <w:pPr>
-              <w:pStyle w:val="FillText"/>
-            </w:pPr>
-            <w:r>
-              <w:rPr>
-                <w:rFonts w:ascii="Calibri" w:hAnsi="Calibri" w:eastAsia="Calibri"/>
-              </w:rPr>
-              <w:t>[Only current blockers]</w:t>
-            </w:r>
-          </w:p>
-          <w:p>
-            <w:pPr>
-              <w:pStyle w:val="Body"/>
-            </w:pPr>
+            <w:vAlign w:val="center"/>
+            <w:shd w:val="clear" w:color="auto" w:fill="FFFBE8"/>
+          </w:tcPr>
+          <w:p>
+            <w:pPr>
+              <w:pStyle w:val="FillText"/>
+            </w:pPr>
+            <w:r/>
+            <w:r>
+              <w:t>Opaque partial Cartesian failure; circular mount-plane/base snap; unverified TMJ landmark subregions/MPR review; active-ROS New Case abort; saved 2.0 mm burr versus 1.5 mm guide bore.</w:t>
+            </w:r>
           </w:p>
         </w:tc>
         <w:tc>
           <w:tcPr>
             <w:tcW w:w="4680" w:type="dxa"/>
-            <w:vAlign w:val="top"/>
-            <w:shd w:val="clear" w:color="auto" w:fill="FFFBE8"/>
-          </w:tcPr>
-          <w:p>
-            <w:pPr>
-              <w:pStyle w:val="FillText"/>
-            </w:pPr>
-            <w:r>
-              <w:rPr>
-                <w:rFonts w:ascii="Calibri" w:hAnsi="Calibri" w:eastAsia="Calibri"/>
-              </w:rPr>
-              <w:t>[Question + reason + revisit trigger]</w:t>
-            </w:r>
-          </w:p>
-          <w:p>
-            <w:pPr>
-              <w:pStyle w:val="Body"/>
-            </w:pPr>
+            <w:vAlign w:val="center"/>
+            <w:shd w:val="clear" w:color="auto" w:fill="FFFBE8"/>
+          </w:tcPr>
+          <w:p>
+            <w:pPr>
+              <w:pStyle w:val="FillText"/>
+            </w:pPr>
+            <w:r/>
+            <w:r>
+              <w:t>Automatic base optimization and multi-tooth sweeps until diagnostics are trustworthy; full canonical frame refactor and physical registration until later tracks; interactive gap slider until Priority-1 safeguards; New GUI aesthetics until Priority 3.</w:t>
+            </w:r>
           </w:p>
         </w:tc>
       </w:tr>
@@ -3060,24 +3032,17 @@
         <w:tc>
           <w:tcPr>
             <w:tcW w:w="7560" w:type="dxa"/>
-            <w:vAlign w:val="top"/>
-            <w:shd w:val="clear" w:color="auto" w:fill="FFFBE8"/>
-          </w:tcPr>
-          <w:p>
-            <w:pPr>
-              <w:pStyle w:val="FillText"/>
-            </w:pPr>
-            <w:r>
-              <w:rPr>
-                <w:rFonts w:ascii="Calibri" w:hAnsi="Calibri" w:eastAsia="Calibri"/>
-              </w:rPr>
-              <w:t>[One bounded work package only]</w:t>
-            </w:r>
-          </w:p>
-          <w:p>
-            <w:pPr>
-              <w:pStyle w:val="Body"/>
-            </w:pPr>
+            <w:vAlign w:val="center"/>
+            <w:shd w:val="clear" w:color="auto" w:fill="FFFBE8"/>
+          </w:tcPr>
+          <w:p>
+            <w:pPr>
+              <w:pStyle w:val="FillText"/>
+            </w:pPr>
+            <w:r/>
+            <w:r>
+              <w:t>Quarantine the circular base snap, use only a labelled manual simulation base, and implement Track B collision geometry/payload audit.</w:t>
+            </w:r>
           </w:p>
         </w:tc>
       </w:tr>
@@ -3106,24 +3071,17 @@
         <w:tc>
           <w:tcPr>
             <w:tcW w:w="7560" w:type="dxa"/>
-            <w:vAlign w:val="top"/>
-            <w:shd w:val="clear" w:color="auto" w:fill="FFFBE8"/>
-          </w:tcPr>
-          <w:p>
-            <w:pPr>
-              <w:pStyle w:val="FillText"/>
-            </w:pPr>
-            <w:r>
-              <w:rPr>
-                <w:rFonts w:ascii="Calibri" w:hAnsi="Calibri" w:eastAsia="Calibri"/>
-              </w:rPr>
-              <w:t>[Next dependency-complete package]</w:t>
-            </w:r>
-          </w:p>
-          <w:p>
-            <w:pPr>
-              <w:pStyle w:val="Body"/>
-            </w:pPr>
+            <w:vAlign w:val="center"/>
+            <w:shd w:val="clear" w:color="auto" w:fill="FFFBE8"/>
+          </w:tcPr>
+          <w:p>
+            <w:pPr>
+              <w:pStyle w:val="FillText"/>
+            </w:pPr>
+            <w:r/>
+            <w:r>
+              <w:t>Track C structured per-candidate/per-stage diagnostics, followed by Track D strict PreEntry, terminal Entry, and guarded drilling stages.</w:t>
+            </w:r>
           </w:p>
         </w:tc>
       </w:tr>
@@ -3152,18 +3110,16 @@
         <w:tc>
           <w:tcPr>
             <w:tcW w:w="7560" w:type="dxa"/>
-            <w:vAlign w:val="top"/>
-            <w:shd w:val="clear" w:color="auto" w:fill="FFFBE8"/>
-          </w:tcPr>
-          <w:p>
-            <w:pPr>
-              <w:pStyle w:val="FillText"/>
-            </w:pPr>
-            <w:r>
-              <w:rPr>
-                <w:rFonts w:ascii="Calibri" w:hAnsi="Calibri" w:eastAsia="Calibri"/>
-              </w:rPr>
-              <w:t>[Important but not allowed to distract now]</w:t>
+            <w:vAlign w:val="center"/>
+            <w:shd w:val="clear" w:color="auto" w:fill="FFFBE8"/>
+          </w:tcPr>
+          <w:p>
+            <w:pPr>
+              <w:pStyle w:val="FillText"/>
+            </w:pPr>
+            <w:r/>
+            <w:r>
+              <w:t>Priority-1 TMJ/crown/MPR safeguards; Priority-2 restore review and jaw-gap preview; Template V0 representative/physical evidence; Priority-3 GUI.</w:t>
             </w:r>
           </w:p>
         </w:tc>
@@ -3193,18 +3149,16 @@
         <w:tc>
           <w:tcPr>
             <w:tcW w:w="7560" w:type="dxa"/>
-            <w:vAlign w:val="top"/>
-            <w:shd w:val="clear" w:color="auto" w:fill="FFFBE8"/>
-          </w:tcPr>
-          <w:p>
-            <w:pPr>
-              <w:pStyle w:val="FillText"/>
-            </w:pPr>
-            <w:r>
-              <w:rPr>
-                <w:rFonts w:ascii="Calibri" w:hAnsi="Calibri" w:eastAsia="Calibri"/>
-              </w:rPr>
-              <w:t>[Feature creep / blocked by missing evidence]</w:t>
+            <w:vAlign w:val="center"/>
+            <w:shd w:val="clear" w:color="auto" w:fill="FFFBE8"/>
+          </w:tcPr>
+          <w:p>
+            <w:pPr>
+              <w:pStyle w:val="FillText"/>
+            </w:pPr>
+            <w:r/>
+            <w:r>
+              <w:t>Unlimited planner/tolerance search; automatic base optimization; broad frame refactor; batch tooth studies; physical registration, hardware homing/execution, drilling, or clinical claims.</w:t>
             </w:r>
           </w:p>
         </w:tc>
@@ -3713,18 +3667,12 @@
         <w:tc>
           <w:tcPr>
             <w:tcW w:w="1150" w:type="dxa"/>
-            <w:vAlign w:val="top"/>
-            <w:shd w:val="clear" w:color="auto" w:fill="FFFBE8"/>
-          </w:tcPr>
-          <w:p>
-            <w:pPr>
-              <w:pStyle w:val="FillText"/>
-            </w:pPr>
-            <w:r>
-              <w:rPr>
-                <w:rFonts w:ascii="Calibri" w:hAnsi="Calibri" w:eastAsia="Calibri"/>
-              </w:rPr>
-              <w:t>[ ]</w:t>
+            <w:vAlign w:val="center"/>
+            <w:shd w:val="clear" w:color="auto" w:fill="FFFBE8"/>
+          </w:tcPr>
+          <w:p>
+            <w:r>
+              <w:t>Current; review due</w:t>
             </w:r>
           </w:p>
         </w:tc>
@@ -3770,18 +3718,12 @@
         <w:tc>
           <w:tcPr>
             <w:tcW w:w="1150" w:type="dxa"/>
-            <w:vAlign w:val="top"/>
-            <w:shd w:val="clear" w:color="auto" w:fill="FFFBE8"/>
-          </w:tcPr>
-          <w:p>
-            <w:pPr>
-              <w:pStyle w:val="FillText"/>
-            </w:pPr>
-            <w:r>
-              <w:rPr>
-                <w:rFonts w:ascii="Calibri" w:hAnsi="Calibri" w:eastAsia="Calibri"/>
-              </w:rPr>
-              <w:t>[ ]</w:t>
+            <w:vAlign w:val="center"/>
+            <w:shd w:val="clear" w:color="auto" w:fill="FFFBE8"/>
+          </w:tcPr>
+          <w:p>
+            <w:r>
+              <w:t>Physical evidence due</w:t>
             </w:r>
           </w:p>
         </w:tc>
@@ -3997,18 +3939,16 @@
         <w:tc>
           <w:tcPr>
             <w:tcW w:w="3760" w:type="dxa"/>
-            <w:vAlign w:val="top"/>
-            <w:shd w:val="clear" w:color="auto" w:fill="FFFBE8"/>
-          </w:tcPr>
-          <w:p>
-            <w:pPr>
-              <w:pStyle w:val="FillText"/>
-            </w:pPr>
-            <w:r>
-              <w:rPr>
-                <w:rFonts w:ascii="Calibri" w:hAnsi="Calibri" w:eastAsia="Calibri"/>
-              </w:rPr>
-              <w:t>[Representative acceptance; freeze boundary]</w:t>
+            <w:vAlign w:val="center"/>
+            <w:shd w:val="clear" w:color="auto" w:fill="FFFBE8"/>
+          </w:tcPr>
+          <w:p>
+            <w:pPr>
+              <w:pStyle w:val="FillText"/>
+            </w:pPr>
+            <w:r/>
+            <w:r>
+              <w:t>Trajectory/template software is mature; Priority-1 TMJ/crown/MPR and representative acceptance remain.</w:t>
             </w:r>
           </w:p>
         </w:tc>
@@ -4054,18 +3994,16 @@
         <w:tc>
           <w:tcPr>
             <w:tcW w:w="3760" w:type="dxa"/>
-            <w:vAlign w:val="top"/>
-            <w:shd w:val="clear" w:color="auto" w:fill="FFFBE8"/>
-          </w:tcPr>
-          <w:p>
-            <w:pPr>
-              <w:pStyle w:val="FillText"/>
-            </w:pPr>
-            <w:r>
-              <w:rPr>
-                <w:rFonts w:ascii="Calibri" w:hAnsi="Calibri" w:eastAsia="Calibri"/>
-              </w:rPr>
-              <w:t>[Print, seat, repeatability, docking]</w:t>
+            <w:vAlign w:val="center"/>
+            <w:shd w:val="clear" w:color="auto" w:fill="FFFBE8"/>
+          </w:tcPr>
+          <w:p>
+            <w:pPr>
+              <w:pStyle w:val="FillText"/>
+            </w:pPr>
+            <w:r/>
+            <w:r>
+              <w:t>Unified template exists; correct burr/bore mismatch, then print, seat, reseat and measure Template V0.</w:t>
             </w:r>
           </w:p>
         </w:tc>
@@ -4111,18 +4049,16 @@
         <w:tc>
           <w:tcPr>
             <w:tcW w:w="3760" w:type="dxa"/>
-            <w:vAlign w:val="top"/>
-            <w:shd w:val="clear" w:color="auto" w:fill="FFFBE8"/>
-          </w:tcPr>
-          <w:p>
-            <w:pPr>
-              <w:pStyle w:val="FillText"/>
-            </w:pPr>
-            <w:r>
-              <w:rPr>
-                <w:rFonts w:ascii="Calibri" w:hAnsi="Calibri" w:eastAsia="Calibri"/>
-              </w:rPr>
-              <w:t>[Frame graph, phantom, TRE]</w:t>
+            <w:vAlign w:val="center"/>
+            <w:shd w:val="clear" w:color="auto" w:fill="FFFBE8"/>
+          </w:tcPr>
+          <w:p>
+            <w:pPr>
+              <w:pStyle w:val="FillText"/>
+            </w:pPr>
+            <w:r/>
+            <w:r>
+              <w:t>Deferred until simulation diagnosis stabilizes; define frame graph, phantom and TRE protocol before motion.</w:t>
             </w:r>
           </w:p>
         </w:tc>
@@ -4168,18 +4104,16 @@
         <w:tc>
           <w:tcPr>
             <w:tcW w:w="3760" w:type="dxa"/>
-            <w:vAlign w:val="top"/>
-            <w:shd w:val="clear" w:color="auto" w:fill="FFFBE8"/>
-          </w:tcPr>
-          <w:p>
-            <w:pPr>
-              <w:pStyle w:val="FillText"/>
-            </w:pPr>
-            <w:r>
-              <w:rPr>
-                <w:rFonts w:ascii="Calibri" w:hAnsi="Calibri" w:eastAsia="Calibri"/>
-              </w:rPr>
-              <w:t>[DOF/workspace/safety → prototype]</w:t>
+            <w:vAlign w:val="center"/>
+            <w:shd w:val="clear" w:color="auto" w:fill="FFFBE8"/>
+          </w:tcPr>
+          <w:p>
+            <w:pPr>
+              <w:pStyle w:val="FillText"/>
+            </w:pPr>
+            <w:r/>
+            <w:r>
+              <w:t>Priority-0 Step 6 collision audit, diagnostics and three-stage simulation; no hardware execution.</w:t>
             </w:r>
           </w:p>
         </w:tc>
@@ -4225,18 +4159,16 @@
         <w:tc>
           <w:tcPr>
             <w:tcW w:w="3760" w:type="dxa"/>
-            <w:vAlign w:val="top"/>
-            <w:shd w:val="clear" w:color="auto" w:fill="FFFBE8"/>
-          </w:tcPr>
-          <w:p>
-            <w:pPr>
-              <w:pStyle w:val="FillText"/>
-            </w:pPr>
-            <w:r>
-              <w:rPr>
-                <w:rFonts w:ascii="Calibri" w:hAnsi="Calibri" w:eastAsia="Calibri"/>
-              </w:rPr>
-              <w:t>[Mechanism, load path, docking]</w:t>
+            <w:vAlign w:val="center"/>
+            <w:shd w:val="clear" w:color="auto" w:fill="FFFBE8"/>
+          </w:tcPr>
+          <w:p>
+            <w:pPr>
+              <w:pStyle w:val="FillText"/>
+            </w:pPr>
+            <w:r/>
+            <w:r>
+              <w:t>Future mechanism lane; retain DOF, load-path and docking questions without active implementation.</w:t>
             </w:r>
           </w:p>
         </w:tc>
@@ -4282,18 +4214,16 @@
         <w:tc>
           <w:tcPr>
             <w:tcW w:w="3760" w:type="dxa"/>
-            <w:vAlign w:val="top"/>
-            <w:shd w:val="clear" w:color="auto" w:fill="FFFBE8"/>
-          </w:tcPr>
-          <w:p>
-            <w:pPr>
-              <w:pStyle w:val="FillText"/>
-            </w:pPr>
-            <w:r>
-              <w:rPr>
-                <w:rFonts w:ascii="Calibri" w:hAnsi="Calibri" w:eastAsia="Calibri"/>
-              </w:rPr>
-              <w:t>[Axis/TCP, depth, loads/thermal]</w:t>
+            <w:vAlign w:val="center"/>
+            <w:shd w:val="clear" w:color="auto" w:fill="FFFBE8"/>
+          </w:tcPr>
+          <w:p>
+            <w:pPr>
+              <w:pStyle w:val="FillText"/>
+            </w:pPr>
+            <w:r/>
+            <w:r>
+              <w:t>TCP remains provisional; physical tool-axis calibration, depth limiting and load/thermal evidence are future.</w:t>
             </w:r>
           </w:p>
         </w:tc>
@@ -4339,18 +4269,16 @@
         <w:tc>
           <w:tcPr>
             <w:tcW w:w="3760" w:type="dxa"/>
-            <w:vAlign w:val="top"/>
-            <w:shd w:val="clear" w:color="auto" w:fill="FFFBE8"/>
-          </w:tcPr>
-          <w:p>
-            <w:pPr>
-              <w:pStyle w:val="FillText"/>
-            </w:pPr>
-            <w:r>
-              <w:rPr>
-                <w:rFonts w:ascii="Calibri" w:hAnsi="Calibri" w:eastAsia="Calibri"/>
-              </w:rPr>
-              <w:t>[Pressure/acoustic bounded experiment]</w:t>
+            <w:vAlign w:val="center"/>
+            <w:shd w:val="clear" w:color="auto" w:fill="FFFBE8"/>
+          </w:tcPr>
+          <w:p>
+            <w:pPr>
+              <w:pStyle w:val="FillText"/>
+            </w:pPr>
+            <w:r/>
+            <w:r>
+              <w:t>Pressure-monitor bench remains separate evidence only; stop logic and controller integration are future.</w:t>
             </w:r>
           </w:p>
         </w:tc>
@@ -4396,18 +4324,16 @@
         <w:tc>
           <w:tcPr>
             <w:tcW w:w="3760" w:type="dxa"/>
-            <w:vAlign w:val="top"/>
-            <w:shd w:val="clear" w:color="auto" w:fill="FFFBE8"/>
-          </w:tcPr>
-          <w:p>
-            <w:pPr>
-              <w:pStyle w:val="FillText"/>
-            </w:pPr>
-            <w:r>
-              <w:rPr>
-                <w:rFonts w:ascii="Calibri" w:hAnsi="Calibri" w:eastAsia="Calibri"/>
-              </w:rPr>
-              <w:t>[Error budget and bench protocol]</w:t>
+            <w:vAlign w:val="center"/>
+            <w:shd w:val="clear" w:color="auto" w:fill="FFFBE8"/>
+          </w:tcPr>
+          <w:p>
+            <w:pPr>
+              <w:pStyle w:val="FillText"/>
+            </w:pPr>
+            <w:r/>
+            <w:r>
+              <w:t>Persist diagnostic evidence now; total-system error budget and physical metrology follow representative work.</w:t>
             </w:r>
           </w:p>
         </w:tc>
@@ -4453,18 +4379,16 @@
         <w:tc>
           <w:tcPr>
             <w:tcW w:w="3760" w:type="dxa"/>
-            <w:vAlign w:val="top"/>
-            <w:shd w:val="clear" w:color="auto" w:fill="FFFBE8"/>
-          </w:tcPr>
-          <w:p>
-            <w:pPr>
-              <w:pStyle w:val="FillText"/>
-            </w:pPr>
-            <w:r>
-              <w:rPr>
-                <w:rFonts w:ascii="Calibri" w:hAnsi="Calibri" w:eastAsia="Calibri"/>
-              </w:rPr>
-              <w:t>[Capture mature work; do not overclaim]</w:t>
+            <w:vAlign w:val="center"/>
+            <w:shd w:val="clear" w:color="auto" w:fill="FFFBE8"/>
+          </w:tcPr>
+          <w:p>
+            <w:pPr>
+              <w:pStyle w:val="FillText"/>
+            </w:pPr>
+            <w:r/>
+            <w:r>
+              <w:t>Capture architecture and evidence after stable milestones; do not publish clinical or hardware claims from simulation.</w:t>
             </w:r>
           </w:p>
         </w:tc>
@@ -4816,29 +4740,25 @@
         <w:tc>
           <w:tcPr>
             <w:tcW w:w="9360" w:type="dxa"/>
-            <w:vAlign w:val="top"/>
-            <w:shd w:val="clear" w:color="auto" w:fill="FFFBE8"/>
-          </w:tcPr>
-          <w:p>
-            <w:pPr>
-              <w:pStyle w:val="FillText"/>
-            </w:pPr>
-            <w:r>
-              <w:rPr>
-                <w:rFonts w:ascii="Calibri" w:hAnsi="Calibri" w:eastAsia="Calibri"/>
-              </w:rPr>
-              <w:t>[Type here]</w:t>
-            </w:r>
-          </w:p>
-          <w:p>
-            <w:pPr>
-              <w:pStyle w:val="Body"/>
-            </w:pPr>
-          </w:p>
-          <w:p>
-            <w:pPr>
-              <w:pStyle w:val="Body"/>
-            </w:pPr>
+            <w:vAlign w:val="center"/>
+            <w:shd w:val="clear" w:color="auto" w:fill="FFFBE8"/>
+          </w:tcPr>
+          <w:p>
+            <w:pPr>
+              <w:pStyle w:val="FillText"/>
+            </w:pPr>
+            <w:r/>
+            <w:r>
+              <w:t>Focus moved from forcing one MoveIt case to pass toward building a trustworthy diagnostic simulation framework.</w:t>
+            </w:r>
+          </w:p>
+          <w:p>
+            <w:pPr>
+              <w:pStyle w:val="FillText"/>
+            </w:pPr>
+            <w:r>
+              <w:t>Save/restore, modular continuation, Step 6A direction and Viewer integrity improved substantially. Collision transfer, failure classification, mount semantics and representative/physical evidence are now the limiting work.</w:t>
+            </w:r>
           </w:p>
         </w:tc>
       </w:tr>
@@ -8471,24 +8391,78 @@
         <w:tc>
           <w:tcPr>
             <w:tcW w:w="3080" w:type="dxa"/>
-            <w:vAlign w:val="top"/>
-            <w:shd w:val="clear" w:color="auto" w:fill="FFFBE8"/>
-          </w:tcPr>
-          <w:p>
-            <w:pPr>
-              <w:pStyle w:val="FillText"/>
-            </w:pPr>
-            <w:r>
-              <w:rPr>
-                <w:rFonts w:ascii="Calibri" w:hAnsi="Calibri" w:eastAsia="Calibri"/>
-              </w:rPr>
-              <w:t>[Frame graph / method]</w:t>
+            <w:vAlign w:val="center"/>
+            <w:shd w:val="clear" w:color="auto" w:fill="FFFBE8"/>
+          </w:tcPr>
+          <w:p>
+            <w:pPr>
+              <w:pStyle w:val="FillText"/>
+            </w:pPr>
+            <w:r/>
+            <w:r>
+              <w:t>Not established: the current percentage is not causal evidence</w:t>
             </w:r>
           </w:p>
         </w:tc>
         <w:tc>
           <w:tcPr>
             <w:tcW w:w="3080" w:type="dxa"/>
+            <w:vAlign w:val="center"/>
+            <w:shd w:val="clear" w:color="auto" w:fill="FFFBE8"/>
+          </w:tcPr>
+          <w:p>
+            <w:pPr>
+              <w:pStyle w:val="FillText"/>
+            </w:pPr>
+            <w:r/>
+            <w:r>
+              <w:t>Complete collision audit and first-failure diagnostics before repositioning conclusions</w:t>
+            </w:r>
+          </w:p>
+        </w:tc>
+      </w:tr>
+      <w:tr>
+        <w:trPr>
+          <w:cantSplit/>
+        </w:trPr>
+        <w:tc>
+          <w:tcPr>
+            <w:tcW w:w="3200" w:type="dxa"/>
+            <w:vAlign w:val="top"/>
+          </w:tcPr>
+          <w:p>
+            <w:pPr>
+              <w:pStyle w:val="TableText"/>
+            </w:pPr>
+            <w:r>
+              <w:rPr>
+                <w:rFonts w:ascii="Calibri" w:hAnsi="Calibri" w:eastAsia="Calibri"/>
+              </w:rPr>
+              <w:t>Can robot reproduce the axis?</w:t>
+            </w:r>
+          </w:p>
+        </w:tc>
+        <w:tc>
+          <w:tcPr>
+            <w:tcW w:w="3080" w:type="dxa"/>
+            <w:vAlign w:val="top"/>
+            <w:shd w:val="clear" w:color="auto" w:fill="FFFBE8"/>
+          </w:tcPr>
+          <w:p>
+            <w:pPr>
+              <w:pStyle w:val="FillText"/>
+            </w:pPr>
+            <w:r>
+              <w:rPr>
+                <w:rFonts w:ascii="Calibri" w:hAnsi="Calibri" w:eastAsia="Calibri"/>
+              </w:rPr>
+              <w:t>[Metrology]</w:t>
+            </w:r>
+          </w:p>
+        </w:tc>
+        <w:tc>
+          <w:tcPr>
+            <w:tcW w:w="3080" w:type="dxa"/>
             <w:vAlign w:val="top"/>
             <w:shd w:val="clear" w:color="auto" w:fill="FFFBE8"/>
           </w:tcPr>
@@ -8522,7 +8496,7 @@
               <w:rPr>
                 <w:rFonts w:ascii="Calibri" w:hAnsi="Calibri" w:eastAsia="Calibri"/>
               </w:rPr>
-              <w:t>Can robot reproduce the axis?</w:t>
+              <w:t>Can drilling be stopped safely?</w:t>
             </w:r>
           </w:p>
         </w:tc>
@@ -8540,7 +8514,7 @@
               <w:rPr>
                 <w:rFonts w:ascii="Calibri" w:hAnsi="Calibri" w:eastAsia="Calibri"/>
               </w:rPr>
-              <w:t>[Metrology]</w:t>
+              <w:t>[Evidence]</w:t>
             </w:r>
           </w:p>
         </w:tc>
@@ -8580,7 +8554,7 @@
               <w:rPr>
                 <w:rFonts w:ascii="Calibri" w:hAnsi="Calibri" w:eastAsia="Calibri"/>
               </w:rPr>
-              <w:t>Can drilling be stopped safely?</w:t>
+              <w:t>What is the dominant error?</w:t>
             </w:r>
           </w:p>
         </w:tc>
@@ -8598,7 +8572,7 @@
               <w:rPr>
                 <w:rFonts w:ascii="Calibri" w:hAnsi="Calibri" w:eastAsia="Calibri"/>
               </w:rPr>
-              <w:t>[Evidence]</w:t>
+              <w:t>[Measured contributor]</w:t>
             </w:r>
           </w:p>
         </w:tc>
@@ -8616,7 +8590,7 @@
               <w:rPr>
                 <w:rFonts w:ascii="Calibri" w:hAnsi="Calibri" w:eastAsia="Calibri"/>
               </w:rPr>
-              <w:t>[Next test]</w:t>
+              <w:t>[Measurement due]</w:t>
             </w:r>
           </w:p>
         </w:tc>
@@ -8638,101 +8612,39 @@
               <w:rPr>
                 <w:rFonts w:ascii="Calibri" w:hAnsi="Calibri" w:eastAsia="Calibri"/>
               </w:rPr>
-              <w:t>What is the dominant error?</w:t>
+              <w:t>What should not be worked on?</w:t>
             </w:r>
           </w:p>
         </w:tc>
         <w:tc>
           <w:tcPr>
             <w:tcW w:w="3080" w:type="dxa"/>
-            <w:vAlign w:val="top"/>
-            <w:shd w:val="clear" w:color="auto" w:fill="FFFBE8"/>
-          </w:tcPr>
-          <w:p>
-            <w:pPr>
-              <w:pStyle w:val="FillText"/>
-            </w:pPr>
-            <w:r>
-              <w:rPr>
-                <w:rFonts w:ascii="Calibri" w:hAnsi="Calibri" w:eastAsia="Calibri"/>
-              </w:rPr>
-              <w:t>[Measured contributor]</w:t>
+            <w:vAlign w:val="center"/>
+            <w:shd w:val="clear" w:color="auto" w:fill="FFFBE8"/>
+          </w:tcPr>
+          <w:p>
+            <w:pPr>
+              <w:pStyle w:val="FillText"/>
+            </w:pPr>
+            <w:r/>
+            <w:r>
+              <w:t>Hardware execution, clinical use, auto-base optimization and broad GUI polish</w:t>
             </w:r>
           </w:p>
         </w:tc>
         <w:tc>
           <w:tcPr>
             <w:tcW w:w="3080" w:type="dxa"/>
-            <w:vAlign w:val="top"/>
-            <w:shd w:val="clear" w:color="auto" w:fill="FFFBE8"/>
-          </w:tcPr>
-          <w:p>
-            <w:pPr>
-              <w:pStyle w:val="FillText"/>
-            </w:pPr>
-            <w:r>
-              <w:rPr>
-                <w:rFonts w:ascii="Calibri" w:hAnsi="Calibri" w:eastAsia="Calibri"/>
-              </w:rPr>
-              <w:t>[Measurement due]</w:t>
-            </w:r>
-          </w:p>
-        </w:tc>
-      </w:tr>
-      <w:tr>
-        <w:trPr>
-          <w:cantSplit/>
-        </w:trPr>
-        <w:tc>
-          <w:tcPr>
-            <w:tcW w:w="3200" w:type="dxa"/>
-            <w:vAlign w:val="top"/>
-          </w:tcPr>
-          <w:p>
-            <w:pPr>
-              <w:pStyle w:val="TableText"/>
-            </w:pPr>
-            <w:r>
-              <w:rPr>
-                <w:rFonts w:ascii="Calibri" w:hAnsi="Calibri" w:eastAsia="Calibri"/>
-              </w:rPr>
-              <w:t>What should not be worked on?</w:t>
-            </w:r>
-          </w:p>
-        </w:tc>
-        <w:tc>
-          <w:tcPr>
-            <w:tcW w:w="3080" w:type="dxa"/>
-            <w:vAlign w:val="top"/>
-            <w:shd w:val="clear" w:color="auto" w:fill="FFFBE8"/>
-          </w:tcPr>
-          <w:p>
-            <w:pPr>
-              <w:pStyle w:val="FillText"/>
-            </w:pPr>
-            <w:r>
-              <w:rPr>
-                <w:rFonts w:ascii="Calibri" w:hAnsi="Calibri" w:eastAsia="Calibri"/>
-              </w:rPr>
-              <w:t>[Frozen/deferred]</w:t>
-            </w:r>
-          </w:p>
-        </w:tc>
-        <w:tc>
-          <w:tcPr>
-            <w:tcW w:w="3080" w:type="dxa"/>
-            <w:vAlign w:val="top"/>
-            <w:shd w:val="clear" w:color="auto" w:fill="FFFBE8"/>
-          </w:tcPr>
-          <w:p>
-            <w:pPr>
-              <w:pStyle w:val="FillText"/>
-            </w:pPr>
-            <w:r>
-              <w:rPr>
-                <w:rFonts w:ascii="Calibri" w:hAnsi="Calibri" w:eastAsia="Calibri"/>
-              </w:rPr>
-              <w:t>[Feature to reject]</w:t>
+            <w:vAlign w:val="center"/>
+            <w:shd w:val="clear" w:color="auto" w:fill="FFFBE8"/>
+          </w:tcPr>
+          <w:p>
+            <w:pPr>
+              <w:pStyle w:val="FillText"/>
+            </w:pPr>
+            <w:r/>
+            <w:r>
+              <w:t>Reject work that bypasses the Priority-0 diagnostic sequence</w:t>
             </w:r>
           </w:p>
         </w:tc>
@@ -8842,18 +8754,16 @@
         <w:tc>
           <w:tcPr>
             <w:tcW w:w="7010" w:type="dxa"/>
-            <w:vAlign w:val="top"/>
-            <w:shd w:val="clear" w:color="auto" w:fill="FFFBE8"/>
-          </w:tcPr>
-          <w:p>
-            <w:pPr>
-              <w:pStyle w:val="FillText"/>
-            </w:pPr>
-            <w:r>
-              <w:rPr>
-                <w:rFonts w:ascii="Calibri" w:hAnsi="Calibri" w:eastAsia="Calibri"/>
-              </w:rPr>
-              <w:t>[Type here]</w:t>
+            <w:vAlign w:val="center"/>
+            <w:shd w:val="clear" w:color="auto" w:fill="FFFBE8"/>
+          </w:tcPr>
+          <w:p>
+            <w:pPr>
+              <w:pStyle w:val="FillText"/>
+            </w:pPr>
+            <w:r/>
+            <w:r>
+              <w:t>28 August 2026 · planning and reconciliation session</w:t>
             </w:r>
           </w:p>
         </w:tc>
@@ -8883,18 +8793,16 @@
         <w:tc>
           <w:tcPr>
             <w:tcW w:w="7010" w:type="dxa"/>
-            <w:vAlign w:val="top"/>
-            <w:shd w:val="clear" w:color="auto" w:fill="FFFBE8"/>
-          </w:tcPr>
-          <w:p>
-            <w:pPr>
-              <w:pStyle w:val="FillText"/>
-            </w:pPr>
-            <w:r>
-              <w:rPr>
-                <w:rFonts w:ascii="Calibri" w:hAnsi="Calibri" w:eastAsia="Calibri"/>
-              </w:rPr>
-              <w:t>[What I expected to learn or finish]</w:t>
+            <w:vAlign w:val="center"/>
+            <w:shd w:val="clear" w:color="auto" w:fill="FFFBE8"/>
+          </w:tcPr>
+          <w:p>
+            <w:pPr>
+              <w:pStyle w:val="FillText"/>
+            </w:pPr>
+            <w:r/>
+            <w:r>
+              <w:t>Recover a clear mental model after a long implementation stretch and set one defensible development order.</w:t>
             </w:r>
           </w:p>
         </w:tc>
@@ -8924,29 +8832,33 @@
         <w:tc>
           <w:tcPr>
             <w:tcW w:w="7010" w:type="dxa"/>
-            <w:vAlign w:val="top"/>
-            <w:shd w:val="clear" w:color="auto" w:fill="FFFBE8"/>
-          </w:tcPr>
-          <w:p>
-            <w:pPr>
-              <w:pStyle w:val="FillText"/>
-            </w:pPr>
-            <w:r>
-              <w:rPr>
-                <w:rFonts w:ascii="Calibri" w:hAnsi="Calibri" w:eastAsia="Calibri"/>
-              </w:rPr>
-              <w:t>[Commands/actions/observations]</w:t>
-            </w:r>
-          </w:p>
-          <w:p>
-            <w:pPr>
-              <w:pStyle w:val="Body"/>
-            </w:pPr>
-          </w:p>
-          <w:p>
-            <w:pPr>
-              <w:pStyle w:val="Body"/>
-            </w:pPr>
+            <w:vAlign w:val="center"/>
+            <w:shd w:val="clear" w:color="auto" w:fill="FFFBE8"/>
+          </w:tcPr>
+          <w:p>
+            <w:pPr>
+              <w:pStyle w:val="FillText"/>
+            </w:pPr>
+            <w:r/>
+            <w:r>
+              <w:t>Reviewed the current Step 6 implementation scope, controlled project documents, task priorities and latest evidence.</w:t>
+            </w:r>
+          </w:p>
+          <w:p>
+            <w:pPr>
+              <w:pStyle w:val="FillText"/>
+            </w:pPr>
+            <w:r>
+              <w:t>Separated symptom from cause: x4 is a negative diagnostic fixture, not proof of a collision, base or mechanical workspace defect.</w:t>
+            </w:r>
+          </w:p>
+          <w:p>
+            <w:pPr>
+              <w:pStyle w:val="FillText"/>
+            </w:pPr>
+            <w:r>
+              <w:t>Promoted collision audit, structured motion diagnosis and three-stage planning into the controlled Priority-0 strategy; no runtime or hardware action was performed.</w:t>
+            </w:r>
           </w:p>
         </w:tc>
       </w:tr>
@@ -8975,18 +8887,16 @@
         <w:tc>
           <w:tcPr>
             <w:tcW w:w="7010" w:type="dxa"/>
-            <w:vAlign w:val="top"/>
-            <w:shd w:val="clear" w:color="auto" w:fill="FFFBE8"/>
-          </w:tcPr>
-          <w:p>
-            <w:pPr>
-              <w:pStyle w:val="FillText"/>
-            </w:pPr>
-            <w:r>
-              <w:rPr>
-                <w:rFonts w:ascii="Calibri" w:hAnsi="Calibri" w:eastAsia="Calibri"/>
-              </w:rPr>
-              <w:t>[Static / Synthetic / Developer-live / Representative / Printed / Clinician]</w:t>
+            <w:vAlign w:val="center"/>
+            <w:shd w:val="clear" w:color="auto" w:fill="FFFBE8"/>
+          </w:tcPr>
+          <w:p>
+            <w:pPr>
+              <w:pStyle w:val="FillText"/>
+            </w:pPr>
+            <w:r/>
+            <w:r>
+              <w:t>Static planning/documentation reconciliation</w:t>
             </w:r>
           </w:p>
         </w:tc>
@@ -9016,18 +8926,16 @@
         <w:tc>
           <w:tcPr>
             <w:tcW w:w="7010" w:type="dxa"/>
-            <w:vAlign w:val="top"/>
-            <w:shd w:val="clear" w:color="auto" w:fill="FFFBE8"/>
-          </w:tcPr>
-          <w:p>
-            <w:pPr>
-              <w:pStyle w:val="FillText"/>
-            </w:pPr>
-            <w:r>
-              <w:rPr>
-                <w:rFonts w:ascii="Calibri" w:hAnsi="Calibri" w:eastAsia="Calibri"/>
-              </w:rPr>
-              <w:t>[Type here]</w:t>
+            <w:vAlign w:val="center"/>
+            <w:shd w:val="clear" w:color="auto" w:fill="FFFBE8"/>
+          </w:tcPr>
+          <w:p>
+            <w:pPr>
+              <w:pStyle w:val="FillText"/>
+            </w:pPr>
+            <w:r/>
+            <w:r>
+              <w:t>Diagnose before optimization. Keep the forehead-mount note unprioritized, but quarantine its circular snap as a Priority-0 dependency.</w:t>
             </w:r>
           </w:p>
         </w:tc>
@@ -9057,18 +8965,16 @@
         <w:tc>
           <w:tcPr>
             <w:tcW w:w="7010" w:type="dxa"/>
-            <w:vAlign w:val="top"/>
-            <w:shd w:val="clear" w:color="auto" w:fill="FFFBE8"/>
-          </w:tcPr>
-          <w:p>
-            <w:pPr>
-              <w:pStyle w:val="FillText"/>
-            </w:pPr>
-            <w:r>
-              <w:rPr>
-                <w:rFonts w:ascii="Calibri" w:hAnsi="Calibri" w:eastAsia="Calibri"/>
-              </w:rPr>
-              <w:t>[Type here]</w:t>
+            <w:vAlign w:val="center"/>
+            <w:shd w:val="clear" w:color="auto" w:fill="FFFBE8"/>
+          </w:tcPr>
+          <w:p>
+            <w:pPr>
+              <w:pStyle w:val="FillText"/>
+            </w:pPr>
+            <w:r/>
+            <w:r>
+              <w:t>No collision audit, diagnostic UI or three-stage refactor has been implemented yet. Representative anatomy, physical fit, registration, TCP and hardware evidence remain absent.</w:t>
             </w:r>
           </w:p>
         </w:tc>
@@ -9098,18 +9004,16 @@
         <w:tc>
           <w:tcPr>
             <w:tcW w:w="7010" w:type="dxa"/>
-            <w:vAlign w:val="top"/>
-            <w:shd w:val="clear" w:color="auto" w:fill="FFFBE8"/>
-          </w:tcPr>
-          <w:p>
-            <w:pPr>
-              <w:pStyle w:val="FillText"/>
-            </w:pPr>
-            <w:r>
-              <w:rPr>
-                <w:rFonts w:ascii="Calibri" w:hAnsi="Calibri" w:eastAsia="Calibri"/>
-              </w:rPr>
-              <w:t>[One concrete step]</w:t>
+            <w:vAlign w:val="center"/>
+            <w:shd w:val="clear" w:color="auto" w:fill="FFFBE8"/>
+          </w:tcPr>
+          <w:p>
+            <w:pPr>
+              <w:pStyle w:val="FillText"/>
+            </w:pPr>
+            <w:r/>
+            <w:r>
+              <w:t>None authorized. Next work remains simulation/software-only: begin Track B after the flawed base snap is visibly quarantined.</w:t>
             </w:r>
           </w:p>
         </w:tc>
@@ -9374,39 +9278,33 @@
         <w:tc>
           <w:tcPr>
             <w:tcW w:w="9360" w:type="dxa"/>
-            <w:vAlign w:val="top"/>
-            <w:shd w:val="clear" w:color="auto" w:fill="FFFBE8"/>
-          </w:tcPr>
-          <w:p>
-            <w:pPr>
-              <w:pStyle w:val="FillText"/>
-            </w:pPr>
-            <w:r>
-              <w:rPr>
-                <w:rFonts w:ascii="Calibri" w:hAnsi="Calibri" w:eastAsia="Calibri"/>
-              </w:rPr>
-              <w:t>[Type here]</w:t>
-            </w:r>
-          </w:p>
-          <w:p>
-            <w:pPr>
-              <w:pStyle w:val="Body"/>
-            </w:pPr>
-          </w:p>
-          <w:p>
-            <w:pPr>
-              <w:pStyle w:val="Body"/>
-            </w:pPr>
-          </w:p>
-          <w:p>
-            <w:pPr>
-              <w:pStyle w:val="Body"/>
-            </w:pPr>
-          </w:p>
-          <w:p>
-            <w:pPr>
-              <w:pStyle w:val="Body"/>
-            </w:pPr>
+            <w:vAlign w:val="center"/>
+            <w:shd w:val="clear" w:color="auto" w:fill="FFFBE8"/>
+          </w:tcPr>
+          <w:p>
+            <w:pPr>
+              <w:pStyle w:val="FillText"/>
+            </w:pPr>
+            <w:r/>
+            <w:r>
+              <w:t>Start from the project tracker dashboard and Priority-0 Development Plan, not the old dated Next section in TASKS.md.</w:t>
+            </w:r>
+          </w:p>
+          <w:p>
+            <w:pPr>
+              <w:pStyle w:val="FillText"/>
+            </w:pPr>
+            <w:r>
+              <w:t>Do not resume planner tuning or broad diagnostic scripts. Preserve x4 as the exact negative fixture, expose the collision payload and first failing state in the normal DENTOWorkflow UI, and keep Execute hidden.</w:t>
+            </w:r>
+          </w:p>
+          <w:p>
+            <w:pPr>
+              <w:pStyle w:val="FillText"/>
+            </w:pPr>
+            <w:r>
+              <w:t>The immediate manual simulation-base datum is only a diagnostic control. It is not forehead truth, registration, or completion of the future mount-frame workstream.</w:t>
+            </w:r>
           </w:p>
         </w:tc>
       </w:tr>
@@ -9415,6 +9313,7 @@
       <w:pPr>
         <w:pStyle w:val="Heading2"/>
         <w:keepNext/>
+        <w:pageBreakBefore/>
       </w:pPr>
       <w:r>
         <w:rPr>
@@ -9517,54 +9416,48 @@
         <w:tc>
           <w:tcPr>
             <w:tcW w:w="4800" w:type="dxa"/>
-            <w:vAlign w:val="top"/>
-            <w:shd w:val="clear" w:color="auto" w:fill="FFFBE8"/>
-          </w:tcPr>
-          <w:p>
-            <w:pPr>
-              <w:pStyle w:val="FillText"/>
-            </w:pPr>
-            <w:r>
-              <w:rPr>
-                <w:rFonts w:ascii="Calibri" w:hAnsi="Calibri" w:eastAsia="Calibri"/>
-              </w:rPr>
-              <w:t>[Type here]</w:t>
+            <w:vAlign w:val="center"/>
+            <w:shd w:val="clear" w:color="auto" w:fill="FFFBE8"/>
+          </w:tcPr>
+          <w:p>
+            <w:pPr>
+              <w:pStyle w:val="FillText"/>
+            </w:pPr>
+            <w:r/>
+            <w:r>
+              <w:t>Choose the numeric Stage-2 terminal tip/contact tolerance</w:t>
             </w:r>
           </w:p>
         </w:tc>
         <w:tc>
           <w:tcPr>
             <w:tcW w:w="2860" w:type="dxa"/>
-            <w:vAlign w:val="top"/>
-            <w:shd w:val="clear" w:color="auto" w:fill="FFFBE8"/>
-          </w:tcPr>
-          <w:p>
-            <w:pPr>
-              <w:pStyle w:val="FillText"/>
-            </w:pPr>
-            <w:r>
-              <w:rPr>
-                <w:rFonts w:ascii="Calibri" w:hAnsi="Calibri" w:eastAsia="Calibri"/>
-              </w:rPr>
-              <w:t>[Type here]</w:t>
+            <w:vAlign w:val="center"/>
+            <w:shd w:val="clear" w:color="auto" w:fill="FFFBE8"/>
+          </w:tcPr>
+          <w:p>
+            <w:pPr>
+              <w:pStyle w:val="FillText"/>
+            </w:pPr>
+            <w:r/>
+            <w:r>
+              <w:t>Requires Track B/C evidence and operator review</w:t>
             </w:r>
           </w:p>
         </w:tc>
         <w:tc>
           <w:tcPr>
             <w:tcW w:w="1700" w:type="dxa"/>
-            <w:vAlign w:val="top"/>
-            <w:shd w:val="clear" w:color="auto" w:fill="FFFBE8"/>
-          </w:tcPr>
-          <w:p>
-            <w:pPr>
-              <w:pStyle w:val="FillText"/>
-            </w:pPr>
-            <w:r>
-              <w:rPr>
-                <w:rFonts w:ascii="Calibri" w:hAnsi="Calibri" w:eastAsia="Calibri"/>
-              </w:rPr>
-              <w:t>[Yes / No / Later]</w:t>
+            <w:vAlign w:val="center"/>
+            <w:shd w:val="clear" w:color="auto" w:fill="FFFBE8"/>
+          </w:tcPr>
+          <w:p>
+            <w:pPr>
+              <w:pStyle w:val="FillText"/>
+            </w:pPr>
+            <w:r/>
+            <w:r>
+              <w:t>Later</w:t>
             </w:r>
           </w:p>
         </w:tc>
@@ -9576,54 +9469,48 @@
         <w:tc>
           <w:tcPr>
             <w:tcW w:w="4800" w:type="dxa"/>
-            <w:vAlign w:val="top"/>
-            <w:shd w:val="clear" w:color="auto" w:fill="FFFBE8"/>
-          </w:tcPr>
-          <w:p>
-            <w:pPr>
-              <w:pStyle w:val="FillText"/>
-            </w:pPr>
-            <w:r>
-              <w:rPr>
-                <w:rFonts w:ascii="Calibri" w:hAnsi="Calibri" w:eastAsia="Calibri"/>
-              </w:rPr>
-              <w:t>[Type here]</w:t>
+            <w:vAlign w:val="center"/>
+            <w:shd w:val="clear" w:color="auto" w:fill="FFFBE8"/>
+          </w:tcPr>
+          <w:p>
+            <w:pPr>
+              <w:pStyle w:val="FillText"/>
+            </w:pPr>
+            <w:r/>
+            <w:r>
+              <w:t>Define the physical base_link-to-mount-face transform</w:t>
             </w:r>
           </w:p>
         </w:tc>
         <w:tc>
           <w:tcPr>
             <w:tcW w:w="2860" w:type="dxa"/>
-            <w:vAlign w:val="top"/>
-            <w:shd w:val="clear" w:color="auto" w:fill="FFFBE8"/>
-          </w:tcPr>
-          <w:p>
-            <w:pPr>
-              <w:pStyle w:val="FillText"/>
-            </w:pPr>
-            <w:r>
-              <w:rPr>
-                <w:rFonts w:ascii="Calibri" w:hAnsi="Calibri" w:eastAsia="Calibri"/>
-              </w:rPr>
-              <w:t>[Type here]</w:t>
+            <w:vAlign w:val="center"/>
+            <w:shd w:val="clear" w:color="auto" w:fill="FFFBE8"/>
+          </w:tcPr>
+          <w:p>
+            <w:pPr>
+              <w:pStyle w:val="FillText"/>
+            </w:pPr>
+            <w:r/>
+            <w:r>
+              <w:t>Requires actual mount CAD, contact side/normal and allowable offset/tilt</w:t>
             </w:r>
           </w:p>
         </w:tc>
         <w:tc>
           <w:tcPr>
             <w:tcW w:w="1700" w:type="dxa"/>
-            <w:vAlign w:val="top"/>
-            <w:shd w:val="clear" w:color="auto" w:fill="FFFBE8"/>
-          </w:tcPr>
-          <w:p>
-            <w:pPr>
-              <w:pStyle w:val="FillText"/>
-            </w:pPr>
-            <w:r>
-              <w:rPr>
-                <w:rFonts w:ascii="Calibri" w:hAnsi="Calibri" w:eastAsia="Calibri"/>
-              </w:rPr>
-              <w:t>[Yes / No / Later]</w:t>
+            <w:vAlign w:val="center"/>
+            <w:shd w:val="clear" w:color="auto" w:fill="FFFBE8"/>
+          </w:tcPr>
+          <w:p>
+            <w:pPr>
+              <w:pStyle w:val="FillText"/>
+            </w:pPr>
+            <w:r/>
+            <w:r>
+              <w:t>Later</w:t>
             </w:r>
           </w:p>
         </w:tc>
@@ -9635,54 +9522,48 @@
         <w:tc>
           <w:tcPr>
             <w:tcW w:w="4800" w:type="dxa"/>
-            <w:vAlign w:val="top"/>
-            <w:shd w:val="clear" w:color="auto" w:fill="FFFBE8"/>
-          </w:tcPr>
-          <w:p>
-            <w:pPr>
-              <w:pStyle w:val="FillText"/>
-            </w:pPr>
-            <w:r>
-              <w:rPr>
-                <w:rFonts w:ascii="Calibri" w:hAnsi="Calibri" w:eastAsia="Calibri"/>
-              </w:rPr>
-              <w:t>[Type here]</w:t>
+            <w:vAlign w:val="center"/>
+            <w:shd w:val="clear" w:color="auto" w:fill="FFFBE8"/>
+          </w:tcPr>
+          <w:p>
+            <w:pPr>
+              <w:pStyle w:val="FillText"/>
+            </w:pPr>
+            <w:r/>
+            <w:r>
+              <w:t>Select the bounded MRML representation for diagnostic sessions</w:t>
             </w:r>
           </w:p>
         </w:tc>
         <w:tc>
           <w:tcPr>
             <w:tcW w:w="2860" w:type="dxa"/>
-            <w:vAlign w:val="top"/>
-            <w:shd w:val="clear" w:color="auto" w:fill="FFFBE8"/>
-          </w:tcPr>
-          <w:p>
-            <w:pPr>
-              <w:pStyle w:val="FillText"/>
-            </w:pPr>
-            <w:r>
-              <w:rPr>
-                <w:rFonts w:ascii="Calibri" w:hAnsi="Calibri" w:eastAsia="Calibri"/>
-              </w:rPr>
-              <w:t>[Type here]</w:t>
+            <w:vAlign w:val="center"/>
+            <w:shd w:val="clear" w:color="auto" w:fill="FFFBE8"/>
+          </w:tcPr>
+          <w:p>
+            <w:pPr>
+              <w:pStyle w:val="FillText"/>
+            </w:pPr>
+            <w:r/>
+            <w:r>
+              <w:t>Implementation design; must preserve fingerprints and exclude live ROS state</w:t>
             </w:r>
           </w:p>
         </w:tc>
         <w:tc>
           <w:tcPr>
             <w:tcW w:w="1700" w:type="dxa"/>
-            <w:vAlign w:val="top"/>
-            <w:shd w:val="clear" w:color="auto" w:fill="FFFBE8"/>
-          </w:tcPr>
-          <w:p>
-            <w:pPr>
-              <w:pStyle w:val="FillText"/>
-            </w:pPr>
-            <w:r>
-              <w:rPr>
-                <w:rFonts w:ascii="Calibri" w:hAnsi="Calibri" w:eastAsia="Calibri"/>
-              </w:rPr>
-              <w:t>[Yes / No / Later]</w:t>
+            <w:vAlign w:val="center"/>
+            <w:shd w:val="clear" w:color="auto" w:fill="FFFBE8"/>
+          </w:tcPr>
+          <w:p>
+            <w:pPr>
+              <w:pStyle w:val="FillText"/>
+            </w:pPr>
+            <w:r/>
+            <w:r>
+              <w:t>Later</w:t>
             </w:r>
           </w:p>
         </w:tc>

</xml_diff>